<commit_message>
docs: Sprint 2 daily scrum update
</commit_message>
<xml_diff>
--- a/ProjectManagement/Sprint2Documents/DailyScrumMeetingNotesSprint2.docx
+++ b/ProjectManagement/Sprint2Documents/DailyScrumMeetingNotesSprint2.docx
@@ -1,6 +1,6 @@
 
 <file path=word/document.xml><?xml version="1.0" encoding="utf-8"?>
-<w:document xmlns:wpc="http://schemas.microsoft.com/office/word/2010/wordprocessingCanvas" xmlns:cx="http://schemas.microsoft.com/office/drawing/2014/chartex" xmlns:cx1="http://schemas.microsoft.com/office/drawing/2015/9/8/chartex" xmlns:cx2="http://schemas.microsoft.com/office/drawing/2015/10/21/chartex" xmlns:cx3="http://schemas.microsoft.com/office/drawing/2016/5/9/chartex" xmlns:cx4="http://schemas.microsoft.com/office/drawing/2016/5/10/chartex" xmlns:cx5="http://schemas.microsoft.com/office/drawing/2016/5/11/chartex" xmlns:cx6="http://schemas.microsoft.com/office/drawing/2016/5/12/chartex" xmlns:cx7="http://schemas.microsoft.com/office/drawing/2016/5/13/chartex" xmlns:cx8="http://schemas.microsoft.com/office/drawing/2016/5/14/chartex" xmlns:mc="http://schemas.openxmlformats.org/markup-compatibility/2006" xmlns:aink="http://schemas.microsoft.com/office/drawing/2016/ink" xmlns:am3d="http://schemas.microsoft.com/office/drawing/2017/model3d" xmlns:o="urn:schemas-microsoft-com:office:office" xmlns:oel="http://schemas.microsoft.com/office/2019/extlst" xmlns:r="http://schemas.openxmlformats.org/officeDocument/2006/relationships" xmlns:m="http://schemas.openxmlformats.org/officeDocument/2006/math" xmlns:v="urn:schemas-microsoft-com:vml" xmlns:wp14="http://schemas.microsoft.com/office/word/2010/wordprocessingDrawing" xmlns:wp="http://schemas.openxmlformats.org/drawingml/2006/wordprocessingDrawing" xmlns:w10="urn:schemas-microsoft-com:office:word" xmlns:w="http://schemas.openxmlformats.org/wordprocessingml/2006/main" xmlns:w14="http://schemas.microsoft.com/office/word/2010/wordml" xmlns:w15="http://schemas.microsoft.com/office/word/2012/wordml" xmlns:w16cex="http://schemas.microsoft.com/office/word/2018/wordml/cex" xmlns:w16cid="http://schemas.microsoft.com/office/word/2016/wordml/cid" xmlns:w16="http://schemas.microsoft.com/office/word/2018/wordml" xmlns:w16du="http://schemas.microsoft.com/office/word/2023/wordml/word16du" xmlns:w16sdtdh="http://schemas.microsoft.com/office/word/2020/wordml/sdtdatahash" xmlns:w16sdtfl="http://schemas.microsoft.com/office/word/2024/wordml/sdtformatlock" xmlns:w16se="http://schemas.microsoft.com/office/word/2015/wordml/symex" xmlns:wpg="http://schemas.microsoft.com/office/word/2010/wordprocessingGroup" xmlns:wpi="http://schemas.microsoft.com/office/word/2010/wordprocessingInk" xmlns:wne="http://schemas.microsoft.com/office/word/2006/wordml" xmlns:wps="http://schemas.microsoft.com/office/word/2010/wordprocessingShape" mc:Ignorable="w14 w15 w16se w16cid w16 w16cex w16sdtdh w16sdtfl w16du wp14">
+<w:document xmlns:wpc="http://schemas.microsoft.com/office/word/2010/wordprocessingCanvas" xmlns:cx="http://schemas.microsoft.com/office/drawing/2014/chartex" xmlns:cx1="http://schemas.microsoft.com/office/drawing/2015/9/8/chartex" xmlns:cx2="http://schemas.microsoft.com/office/drawing/2015/10/21/chartex" xmlns:cx3="http://schemas.microsoft.com/office/drawing/2016/5/9/chartex" xmlns:cx4="http://schemas.microsoft.com/office/drawing/2016/5/10/chartex" xmlns:cx5="http://schemas.microsoft.com/office/drawing/2016/5/11/chartex" xmlns:cx6="http://schemas.microsoft.com/office/drawing/2016/5/12/chartex" xmlns:cx7="http://schemas.microsoft.com/office/drawing/2016/5/13/chartex" xmlns:cx8="http://schemas.microsoft.com/office/drawing/2016/5/14/chartex" xmlns:mc="http://schemas.openxmlformats.org/markup-compatibility/2006" xmlns:aink="http://schemas.microsoft.com/office/drawing/2016/ink" xmlns:am3d="http://schemas.microsoft.com/office/drawing/2017/model3d" xmlns:o="urn:schemas-microsoft-com:office:office" xmlns:oel="http://schemas.microsoft.com/office/2019/extlst" xmlns:r="http://schemas.openxmlformats.org/officeDocument/2006/relationships" xmlns:m="http://schemas.openxmlformats.org/officeDocument/2006/math" xmlns:v="urn:schemas-microsoft-com:vml" xmlns:wp14="http://schemas.microsoft.com/office/word/2010/wordprocessingDrawing" xmlns:wp="http://schemas.openxmlformats.org/drawingml/2006/wordprocessingDrawing" xmlns:w10="urn:schemas-microsoft-com:office:word" xmlns:w="http://schemas.openxmlformats.org/wordprocessingml/2006/main" xmlns:w14="http://schemas.microsoft.com/office/word/2010/wordml" xmlns:w15="http://schemas.microsoft.com/office/word/2012/wordml" xmlns:w16cei="http://schemas.microsoft.com/office/word/2026/wordml/cei" xmlns:w16cex="http://schemas.microsoft.com/office/word/2018/wordml/cex" xmlns:w16cid="http://schemas.microsoft.com/office/word/2016/wordml/cid" xmlns:w16="http://schemas.microsoft.com/office/word/2018/wordml" xmlns:w16du="http://schemas.microsoft.com/office/word/2023/wordml/word16du" xmlns:w16sdtdh="http://schemas.microsoft.com/office/word/2020/wordml/sdtdatahash" xmlns:w16sdtfl="http://schemas.microsoft.com/office/word/2024/wordml/sdtformatlock" xmlns:w16se="http://schemas.microsoft.com/office/word/2015/wordml/symex" xmlns:wpg="http://schemas.microsoft.com/office/word/2010/wordprocessingGroup" xmlns:wpi="http://schemas.microsoft.com/office/word/2010/wordprocessingInk" xmlns:wne="http://schemas.microsoft.com/office/word/2006/wordml" xmlns:wps="http://schemas.microsoft.com/office/word/2010/wordprocessingShape" mc:Ignorable="w14 w15 w16se w16cid w16 w16cex w16sdtdh w16sdtfl w16du wp14">
   <w:body>
     <w:p>
       <w:pPr>
@@ -174,7 +174,42 @@
           <w:lang w:eastAsia="tr-TR"/>
           <w14:ligatures w14:val="none"/>
         </w:rPr>
-        <w:t>nedeniyle bu sprint süresince izinlidir.</w:t>
+        <w:t xml:space="preserve">nedeniyle bu sprint süresince </w:t>
+      </w:r>
+      <w:proofErr w:type="spellStart"/>
+      <w:r>
+        <w:rPr>
+          <w:rFonts w:ascii="Times New Roman" w:eastAsia="Times New Roman" w:hAnsi="Times New Roman" w:cs="Times New Roman"/>
+          <w:kern w:val="0"/>
+          <w:sz w:val="24"/>
+          <w:szCs w:val="24"/>
+          <w:lang w:eastAsia="tr-TR"/>
+          <w14:ligatures w14:val="none"/>
+        </w:rPr>
+        <w:t>izinlidir.</w:t>
+      </w:r>
+      <w:r>
+        <w:rPr>
+          <w:rFonts w:ascii="Times New Roman" w:eastAsia="Times New Roman" w:hAnsi="Times New Roman" w:cs="Times New Roman"/>
+          <w:kern w:val="0"/>
+          <w:sz w:val="24"/>
+          <w:szCs w:val="24"/>
+          <w:lang w:eastAsia="tr-TR"/>
+          <w14:ligatures w14:val="none"/>
+        </w:rPr>
+        <w:t>Yaren</w:t>
+      </w:r>
+      <w:proofErr w:type="spellEnd"/>
+      <w:r>
+        <w:rPr>
+          <w:rFonts w:ascii="Times New Roman" w:eastAsia="Times New Roman" w:hAnsi="Times New Roman" w:cs="Times New Roman"/>
+          <w:kern w:val="0"/>
+          <w:sz w:val="24"/>
+          <w:szCs w:val="24"/>
+          <w:lang w:eastAsia="tr-TR"/>
+          <w14:ligatures w14:val="none"/>
+        </w:rPr>
+        <w:t>, bu sprintte kişisel bir sürecinden ötürü aktif katılım gösterememiştir; araştırma ve veri toplama aşamalarındaki önceki katkıları not edilmiştir.</w:t>
       </w:r>
     </w:p>
     <w:p>
@@ -487,7 +522,6 @@
         <w:t xml:space="preserve"> dosyasına </w:t>
       </w:r>
       <w:proofErr w:type="spellStart"/>
-      <w:proofErr w:type="gramStart"/>
       <w:r>
         <w:rPr>
           <w:rFonts w:ascii="Times New Roman" w:eastAsia="Times New Roman" w:hAnsi="Times New Roman" w:cs="Times New Roman"/>
@@ -511,7 +545,6 @@
         <w:t>SQLAlchemy</w:t>
       </w:r>
       <w:proofErr w:type="spellEnd"/>
-      <w:proofErr w:type="gramEnd"/>
       <w:r>
         <w:rPr>
           <w:rFonts w:ascii="Times New Roman" w:eastAsia="Times New Roman" w:hAnsi="Times New Roman" w:cs="Times New Roman"/>
@@ -2146,7 +2179,6 @@
         <w:t xml:space="preserve"> yüzünden erken kapanma hatasını (</w:t>
       </w:r>
       <w:proofErr w:type="spellStart"/>
-      <w:proofErr w:type="gramStart"/>
       <w:r>
         <w:rPr>
           <w:rFonts w:ascii="Courier New" w:eastAsia="Times New Roman" w:hAnsi="Courier New" w:cs="Courier New"/>
@@ -2159,7 +2191,6 @@
         <w:t>psycopg.OperationalError</w:t>
       </w:r>
       <w:proofErr w:type="spellEnd"/>
-      <w:proofErr w:type="gramEnd"/>
       <w:r>
         <w:rPr>
           <w:rFonts w:ascii="Times New Roman" w:eastAsia="Times New Roman" w:hAnsi="Times New Roman" w:cs="Times New Roman"/>
@@ -2265,7 +2296,6 @@
           <w:lang w:eastAsia="tr-TR"/>
           <w14:ligatures w14:val="none"/>
         </w:rPr>
-        <w:lastRenderedPageBreak/>
         <w:t>--- 15 Temmuz ---</w:t>
       </w:r>
     </w:p>
@@ -2680,7 +2710,6 @@
         </w:rPr>
         <w:t xml:space="preserve"> bozulmadığını kanıtlayan regresyon test paketini (</w:t>
       </w:r>
-      <w:proofErr w:type="gramStart"/>
       <w:r>
         <w:rPr>
           <w:rFonts w:ascii="Courier New" w:eastAsia="Times New Roman" w:hAnsi="Courier New" w:cs="Courier New"/>
@@ -2701,19 +2730,7 @@
           <w:lang w:eastAsia="tr-TR"/>
           <w14:ligatures w14:val="none"/>
         </w:rPr>
-        <w:t xml:space="preserve"> -</w:t>
-      </w:r>
-      <w:proofErr w:type="gramEnd"/>
-      <w:r>
-        <w:rPr>
-          <w:rFonts w:ascii="Times New Roman" w:eastAsia="Times New Roman" w:hAnsi="Times New Roman" w:cs="Times New Roman"/>
-          <w:kern w:val="0"/>
-          <w:sz w:val="24"/>
-          <w:szCs w:val="24"/>
-          <w:lang w:eastAsia="tr-TR"/>
-          <w14:ligatures w14:val="none"/>
-        </w:rPr>
-        <w:t xml:space="preserve"> CP-39) yazdım. Toplamda 53 testin tamamı başarıyla geçiyor. </w:t>
+        <w:t xml:space="preserve"> - CP-39) yazdım. Toplamda 53 testin tamamı başarıyla geçiyor. </w:t>
       </w:r>
       <w:proofErr w:type="spellStart"/>
       <w:r>
@@ -2863,7 +2880,7 @@
 </file>
 
 <file path=word/numbering.xml><?xml version="1.0" encoding="utf-8"?>
-<w:numbering xmlns:wpc="http://schemas.microsoft.com/office/word/2010/wordprocessingCanvas" xmlns:cx="http://schemas.microsoft.com/office/drawing/2014/chartex" xmlns:cx1="http://schemas.microsoft.com/office/drawing/2015/9/8/chartex" xmlns:cx2="http://schemas.microsoft.com/office/drawing/2015/10/21/chartex" xmlns:cx3="http://schemas.microsoft.com/office/drawing/2016/5/9/chartex" xmlns:cx4="http://schemas.microsoft.com/office/drawing/2016/5/10/chartex" xmlns:cx5="http://schemas.microsoft.com/office/drawing/2016/5/11/chartex" xmlns:cx6="http://schemas.microsoft.com/office/drawing/2016/5/12/chartex" xmlns:cx7="http://schemas.microsoft.com/office/drawing/2016/5/13/chartex" xmlns:cx8="http://schemas.microsoft.com/office/drawing/2016/5/14/chartex" xmlns:mc="http://schemas.openxmlformats.org/markup-compatibility/2006" xmlns:aink="http://schemas.microsoft.com/office/drawing/2016/ink" xmlns:am3d="http://schemas.microsoft.com/office/drawing/2017/model3d" xmlns:o="urn:schemas-microsoft-com:office:office" xmlns:oel="http://schemas.microsoft.com/office/2019/extlst" xmlns:r="http://schemas.openxmlformats.org/officeDocument/2006/relationships" xmlns:m="http://schemas.openxmlformats.org/officeDocument/2006/math" xmlns:v="urn:schemas-microsoft-com:vml" xmlns:wp14="http://schemas.microsoft.com/office/word/2010/wordprocessingDrawing" xmlns:wp="http://schemas.openxmlformats.org/drawingml/2006/wordprocessingDrawing" xmlns:w10="urn:schemas-microsoft-com:office:word" xmlns:w="http://schemas.openxmlformats.org/wordprocessingml/2006/main" xmlns:w14="http://schemas.microsoft.com/office/word/2010/wordml" xmlns:w15="http://schemas.microsoft.com/office/word/2012/wordml" xmlns:w16cex="http://schemas.microsoft.com/office/word/2018/wordml/cex" xmlns:w16cid="http://schemas.microsoft.com/office/word/2016/wordml/cid" xmlns:w16="http://schemas.microsoft.com/office/word/2018/wordml" xmlns:w16du="http://schemas.microsoft.com/office/word/2023/wordml/word16du" xmlns:w16sdtdh="http://schemas.microsoft.com/office/word/2020/wordml/sdtdatahash" xmlns:w16sdtfl="http://schemas.microsoft.com/office/word/2024/wordml/sdtformatlock" xmlns:w16se="http://schemas.microsoft.com/office/word/2015/wordml/symex" xmlns:wpg="http://schemas.microsoft.com/office/word/2010/wordprocessingGroup" xmlns:wpi="http://schemas.microsoft.com/office/word/2010/wordprocessingInk" xmlns:wne="http://schemas.microsoft.com/office/word/2006/wordml" xmlns:wps="http://schemas.microsoft.com/office/word/2010/wordprocessingShape" mc:Ignorable="w14 w15 w16se w16cid w16 w16cex w16sdtdh w16sdtfl w16du wp14">
+<w:numbering xmlns:wpc="http://schemas.microsoft.com/office/word/2010/wordprocessingCanvas" xmlns:cx="http://schemas.microsoft.com/office/drawing/2014/chartex" xmlns:cx1="http://schemas.microsoft.com/office/drawing/2015/9/8/chartex" xmlns:cx2="http://schemas.microsoft.com/office/drawing/2015/10/21/chartex" xmlns:cx3="http://schemas.microsoft.com/office/drawing/2016/5/9/chartex" xmlns:cx4="http://schemas.microsoft.com/office/drawing/2016/5/10/chartex" xmlns:cx5="http://schemas.microsoft.com/office/drawing/2016/5/11/chartex" xmlns:cx6="http://schemas.microsoft.com/office/drawing/2016/5/12/chartex" xmlns:cx7="http://schemas.microsoft.com/office/drawing/2016/5/13/chartex" xmlns:cx8="http://schemas.microsoft.com/office/drawing/2016/5/14/chartex" xmlns:mc="http://schemas.openxmlformats.org/markup-compatibility/2006" xmlns:aink="http://schemas.microsoft.com/office/drawing/2016/ink" xmlns:am3d="http://schemas.microsoft.com/office/drawing/2017/model3d" xmlns:o="urn:schemas-microsoft-com:office:office" xmlns:oel="http://schemas.microsoft.com/office/2019/extlst" xmlns:r="http://schemas.openxmlformats.org/officeDocument/2006/relationships" xmlns:m="http://schemas.openxmlformats.org/officeDocument/2006/math" xmlns:v="urn:schemas-microsoft-com:vml" xmlns:wp14="http://schemas.microsoft.com/office/word/2010/wordprocessingDrawing" xmlns:wp="http://schemas.openxmlformats.org/drawingml/2006/wordprocessingDrawing" xmlns:w10="urn:schemas-microsoft-com:office:word" xmlns:w="http://schemas.openxmlformats.org/wordprocessingml/2006/main" xmlns:w14="http://schemas.microsoft.com/office/word/2010/wordml" xmlns:w15="http://schemas.microsoft.com/office/word/2012/wordml" xmlns:w16cei="http://schemas.microsoft.com/office/word/2026/wordml/cei" xmlns:w16cex="http://schemas.microsoft.com/office/word/2018/wordml/cex" xmlns:w16cid="http://schemas.microsoft.com/office/word/2016/wordml/cid" xmlns:w16="http://schemas.microsoft.com/office/word/2018/wordml" xmlns:w16du="http://schemas.microsoft.com/office/word/2023/wordml/word16du" xmlns:w16sdtdh="http://schemas.microsoft.com/office/word/2020/wordml/sdtdatahash" xmlns:w16sdtfl="http://schemas.microsoft.com/office/word/2024/wordml/sdtformatlock" xmlns:w16se="http://schemas.microsoft.com/office/word/2015/wordml/symex" xmlns:wpg="http://schemas.microsoft.com/office/word/2010/wordprocessingGroup" xmlns:wpi="http://schemas.microsoft.com/office/word/2010/wordprocessingInk" xmlns:wne="http://schemas.microsoft.com/office/word/2006/wordml" xmlns:wps="http://schemas.microsoft.com/office/word/2010/wordprocessingShape" mc:Ignorable="w14 w15 w16se w16cid w16 w16cex w16sdtdh w16sdtfl w16du wp14">
   <w:abstractNum w:abstractNumId="0" w15:restartNumberingAfterBreak="0">
     <w:nsid w:val="11786E4B"/>
     <w:multiLevelType w:val="multilevel"/>

</xml_diff>